<commit_message>
Books Changes - Auto commit
</commit_message>
<xml_diff>
--- a/JavaAgain/Resume/Satya_JavaFullStack_9 yrs_Final.docx
+++ b/JavaAgain/Resume/Satya_JavaFullStack_9 yrs_Final.docx
@@ -931,6 +931,12 @@
             <w:r>
               <w:t>AngularJS, Angular, ReactJS</w:t>
             </w:r>
+            <w:r>
+              <w:t xml:space="preserve">, </w:t>
+            </w:r>
+            <w:r>
+              <w:t>NodeJS</w:t>
+            </w:r>
           </w:p>
           <w:p>
             <w:pPr>
@@ -971,7 +977,13 @@
               </w:numPr>
             </w:pPr>
             <w:r>
-              <w:t xml:space="preserve">MySQL, Oracle, IBM DB2, MongoDB </w:t>
+              <w:t xml:space="preserve">MySQL, Oracle, IBM DB2, </w:t>
+            </w:r>
+            <w:r>
+              <w:t xml:space="preserve">Teradata, </w:t>
+            </w:r>
+            <w:r>
+              <w:t xml:space="preserve">MongoDB </w:t>
             </w:r>
           </w:p>
         </w:tc>
@@ -2517,10 +2529,12 @@
     </w:p>
     <w:p>
       <w:pPr>
-        <w:spacing w:before="0" w:beforeAutospacing="0" w:after="0"/>
-        <w:rPr>
-          <w:b/>
-          <w:bCs/>
+        <w:spacing w:before="0" w:beforeAutospacing="0" w:after="0" w:line="240" w:lineRule="auto"/>
+        <w:rPr>
+          <w:rFonts w:cs="Segoe UI"/>
+          <w:b/>
+          <w:color w:val="1D1B11"/>
+          <w:szCs w:val="20"/>
         </w:rPr>
       </w:pPr>
       <w:r>
@@ -2599,17 +2613,6 @@
         </w:rPr>
         <w:t>.</w:t>
       </w:r>
-    </w:p>
-    <w:p>
-      <w:pPr>
-        <w:spacing w:before="0" w:beforeAutospacing="0" w:after="0"/>
-        <w:rPr>
-          <w:rFonts w:cs="Segoe UI"/>
-          <w:b/>
-          <w:color w:val="1D1B11"/>
-          <w:szCs w:val="20"/>
-        </w:rPr>
-      </w:pPr>
     </w:p>
     <w:p>
       <w:pPr>
@@ -2939,6 +2942,7 @@
         <w:spacing w:before="0" w:beforeAutospacing="0" w:after="0"/>
         <w:rPr>
           <w:rFonts w:cs="Segoe UI"/>
+          <w:b/>
           <w:color w:val="1D1B11"/>
           <w:szCs w:val="20"/>
         </w:rPr>
@@ -2969,17 +2973,15 @@
         </w:rPr>
         <w:t>Spring, Spring Boot, MongoDB, Jira, BitBucket, Bamboo, SonarQube, Angular</w:t>
       </w:r>
-    </w:p>
-    <w:p>
-      <w:pPr>
-        <w:spacing w:before="0" w:beforeAutospacing="0" w:after="0"/>
-        <w:rPr>
-          <w:rFonts w:cs="Segoe UI"/>
-          <w:b/>
-          <w:color w:val="1D1B11"/>
-          <w:szCs w:val="20"/>
-        </w:rPr>
-      </w:pPr>
+      <w:r>
+        <w:rPr>
+          <w:rFonts w:cs="Segoe UI"/>
+          <w:b/>
+          <w:color w:val="1D1B11"/>
+          <w:szCs w:val="20"/>
+        </w:rPr>
+        <w:t>.</w:t>
+      </w:r>
     </w:p>
     <w:p>
       <w:pPr>
@@ -3320,61 +3322,99 @@
           <w:color w:val="1D1B11"/>
           <w:szCs w:val="20"/>
         </w:rPr>
-        <w:t>Role Description:</w:t>
-      </w:r>
-      <w:r>
-        <w:rPr>
-          <w:rFonts w:cs="Segoe UI"/>
-          <w:color w:val="1D1B11"/>
-          <w:szCs w:val="20"/>
-        </w:rPr>
-        <w:t xml:space="preserve"> CICD Pipeline &amp; Build Automation</w:t>
-      </w:r>
-      <w:r>
-        <w:rPr>
-          <w:rFonts w:cs="Segoe UI"/>
-          <w:color w:val="1D1B11"/>
+        <w:t>Roles and Responsibilities:</w:t>
+      </w:r>
+    </w:p>
+    <w:p>
+      <w:pPr>
+        <w:pStyle w:val="ListParagraph"/>
+        <w:numPr>
+          <w:ilvl w:val="0"/>
+          <w:numId w:val="26"/>
+        </w:numPr>
+        <w:spacing w:before="0" w:beforeAutospacing="0" w:after="0"/>
+        <w:rPr>
+          <w:rFonts w:cs="Segoe UI"/>
+          <w:szCs w:val="20"/>
+        </w:rPr>
+      </w:pPr>
+      <w:r>
+        <w:rPr>
+          <w:rFonts w:cs="Segoe UI"/>
+          <w:szCs w:val="20"/>
+        </w:rPr>
+        <w:t xml:space="preserve">Migrating code from TFS to BitBucket. </w:t>
+      </w:r>
+    </w:p>
+    <w:p>
+      <w:pPr>
+        <w:pStyle w:val="ListParagraph"/>
+        <w:numPr>
+          <w:ilvl w:val="0"/>
+          <w:numId w:val="26"/>
+        </w:numPr>
+        <w:spacing w:before="0" w:beforeAutospacing="0" w:after="0"/>
+        <w:rPr>
+          <w:rFonts w:cs="Segoe UI"/>
+          <w:szCs w:val="20"/>
+        </w:rPr>
+      </w:pPr>
+      <w:r>
+        <w:rPr>
+          <w:rFonts w:cs="Segoe UI"/>
+          <w:color w:val="1D1B11"/>
+          <w:szCs w:val="20"/>
+        </w:rPr>
+        <w:t>Create and maintain fully automated CI/CD pipelines for code deployment using BitBucket &amp; Bamboo</w:t>
+      </w:r>
+    </w:p>
+    <w:p>
+      <w:pPr>
+        <w:pStyle w:val="ListParagraph"/>
+        <w:numPr>
+          <w:ilvl w:val="0"/>
+          <w:numId w:val="26"/>
+        </w:numPr>
+        <w:spacing w:before="0" w:beforeAutospacing="0" w:after="0"/>
+        <w:rPr>
+          <w:rFonts w:cs="Segoe UI"/>
+          <w:szCs w:val="20"/>
+        </w:rPr>
+      </w:pPr>
+      <w:r>
+        <w:rPr>
+          <w:rFonts w:cs="Segoe UI"/>
+          <w:szCs w:val="20"/>
+        </w:rPr>
+        <w:t>Integrating SonarQube, JIRA, Veracode to the CICD Pipeline.</w:t>
+      </w:r>
+    </w:p>
+    <w:p>
+      <w:pPr>
+        <w:pStyle w:val="ListParagraph"/>
+        <w:numPr>
+          <w:ilvl w:val="0"/>
+          <w:numId w:val="26"/>
+        </w:numPr>
+        <w:spacing w:before="0" w:beforeAutospacing="0" w:after="0"/>
+        <w:rPr>
+          <w:rFonts w:cs="Segoe UI"/>
+          <w:szCs w:val="20"/>
+        </w:rPr>
+      </w:pPr>
+      <w:r>
+        <w:rPr>
+          <w:rFonts w:cs="Segoe UI"/>
+          <w:szCs w:val="20"/>
+        </w:rPr>
+        <w:t>Support &amp; Monitor the Build &amp; Deployment Automation</w:t>
+      </w:r>
+      <w:r>
+        <w:rPr>
+          <w:rFonts w:cs="Segoe UI"/>
           <w:szCs w:val="20"/>
         </w:rPr>
         <w:t>.</w:t>
-      </w:r>
-    </w:p>
-    <w:p>
-      <w:pPr>
-        <w:spacing w:before="0" w:beforeAutospacing="0" w:after="0"/>
-        <w:rPr>
-          <w:rFonts w:cs="Segoe UI"/>
-          <w:color w:val="1D1B11"/>
-          <w:szCs w:val="20"/>
-        </w:rPr>
-      </w:pPr>
-    </w:p>
-    <w:p>
-      <w:pPr>
-        <w:spacing w:before="0" w:beforeAutospacing="0" w:after="0"/>
-        <w:rPr>
-          <w:rFonts w:cs="Segoe UI"/>
-          <w:b/>
-          <w:color w:val="1D1B11"/>
-          <w:szCs w:val="20"/>
-          <w:u w:val="single"/>
-        </w:rPr>
-      </w:pPr>
-      <w:r>
-        <w:rPr>
-          <w:rFonts w:cs="Segoe UI"/>
-          <w:b/>
-          <w:color w:val="1D1B11"/>
-          <w:szCs w:val="20"/>
-        </w:rPr>
-        <w:t xml:space="preserve">Project Details: </w:t>
-      </w:r>
-      <w:r>
-        <w:rPr>
-          <w:rFonts w:cs="Segoe UI"/>
-          <w:szCs w:val="20"/>
-        </w:rPr>
-        <w:t>Migrating code from TFS to BitBucket. Creating CICD Pipeline using BitBucket &amp; Bamboo. Integrating SonarQube, JIRA, Veracode to the CICD Pipeline.</w:t>
       </w:r>
     </w:p>
     <w:p>
@@ -4500,25 +4540,7 @@
           <w:color w:val="1D1B11"/>
           <w:szCs w:val="20"/>
         </w:rPr>
-        <w:t xml:space="preserve"> Analysis, </w:t>
-      </w:r>
-      <w:proofErr w:type="gramStart"/>
-      <w:r>
-        <w:rPr>
-          <w:rFonts w:cs="Segoe UI"/>
-          <w:color w:val="1D1B11"/>
-          <w:szCs w:val="20"/>
-        </w:rPr>
-        <w:t>Design</w:t>
-      </w:r>
-      <w:proofErr w:type="gramEnd"/>
-      <w:r>
-        <w:rPr>
-          <w:rFonts w:cs="Segoe UI"/>
-          <w:color w:val="1D1B11"/>
-          <w:szCs w:val="20"/>
-        </w:rPr>
-        <w:t xml:space="preserve"> and coding</w:t>
+        <w:t xml:space="preserve"> Analysis, Design and coding</w:t>
       </w:r>
       <w:r>
         <w:rPr>
@@ -5802,6 +5824,119 @@
     </w:lvl>
   </w:abstractNum>
   <w:abstractNum w:abstractNumId="9" w15:restartNumberingAfterBreak="0">
+    <w:nsid w:val="2784354B"/>
+    <w:multiLevelType w:val="hybridMultilevel"/>
+    <w:tmpl w:val="6A721422"/>
+    <w:lvl w:ilvl="0" w:tplc="04090001">
+      <w:start w:val="1"/>
+      <w:numFmt w:val="bullet"/>
+      <w:lvlText w:val=""/>
+      <w:lvlJc w:val="left"/>
+      <w:pPr>
+        <w:ind w:left="720" w:hanging="360"/>
+      </w:pPr>
+      <w:rPr>
+        <w:rFonts w:ascii="Symbol" w:hAnsi="Symbol" w:hint="default"/>
+      </w:rPr>
+    </w:lvl>
+    <w:lvl w:ilvl="1" w:tplc="04090003" w:tentative="1">
+      <w:start w:val="1"/>
+      <w:numFmt w:val="bullet"/>
+      <w:lvlText w:val="o"/>
+      <w:lvlJc w:val="left"/>
+      <w:pPr>
+        <w:ind w:left="1440" w:hanging="360"/>
+      </w:pPr>
+      <w:rPr>
+        <w:rFonts w:ascii="Courier New" w:hAnsi="Courier New" w:cs="Courier New" w:hint="default"/>
+      </w:rPr>
+    </w:lvl>
+    <w:lvl w:ilvl="2" w:tplc="04090005" w:tentative="1">
+      <w:start w:val="1"/>
+      <w:numFmt w:val="bullet"/>
+      <w:lvlText w:val=""/>
+      <w:lvlJc w:val="left"/>
+      <w:pPr>
+        <w:ind w:left="2160" w:hanging="360"/>
+      </w:pPr>
+      <w:rPr>
+        <w:rFonts w:ascii="Wingdings" w:hAnsi="Wingdings" w:hint="default"/>
+      </w:rPr>
+    </w:lvl>
+    <w:lvl w:ilvl="3" w:tplc="04090001" w:tentative="1">
+      <w:start w:val="1"/>
+      <w:numFmt w:val="bullet"/>
+      <w:lvlText w:val=""/>
+      <w:lvlJc w:val="left"/>
+      <w:pPr>
+        <w:ind w:left="2880" w:hanging="360"/>
+      </w:pPr>
+      <w:rPr>
+        <w:rFonts w:ascii="Symbol" w:hAnsi="Symbol" w:hint="default"/>
+      </w:rPr>
+    </w:lvl>
+    <w:lvl w:ilvl="4" w:tplc="04090003" w:tentative="1">
+      <w:start w:val="1"/>
+      <w:numFmt w:val="bullet"/>
+      <w:lvlText w:val="o"/>
+      <w:lvlJc w:val="left"/>
+      <w:pPr>
+        <w:ind w:left="3600" w:hanging="360"/>
+      </w:pPr>
+      <w:rPr>
+        <w:rFonts w:ascii="Courier New" w:hAnsi="Courier New" w:cs="Courier New" w:hint="default"/>
+      </w:rPr>
+    </w:lvl>
+    <w:lvl w:ilvl="5" w:tplc="04090005" w:tentative="1">
+      <w:start w:val="1"/>
+      <w:numFmt w:val="bullet"/>
+      <w:lvlText w:val=""/>
+      <w:lvlJc w:val="left"/>
+      <w:pPr>
+        <w:ind w:left="4320" w:hanging="360"/>
+      </w:pPr>
+      <w:rPr>
+        <w:rFonts w:ascii="Wingdings" w:hAnsi="Wingdings" w:hint="default"/>
+      </w:rPr>
+    </w:lvl>
+    <w:lvl w:ilvl="6" w:tplc="04090001" w:tentative="1">
+      <w:start w:val="1"/>
+      <w:numFmt w:val="bullet"/>
+      <w:lvlText w:val=""/>
+      <w:lvlJc w:val="left"/>
+      <w:pPr>
+        <w:ind w:left="5040" w:hanging="360"/>
+      </w:pPr>
+      <w:rPr>
+        <w:rFonts w:ascii="Symbol" w:hAnsi="Symbol" w:hint="default"/>
+      </w:rPr>
+    </w:lvl>
+    <w:lvl w:ilvl="7" w:tplc="04090003" w:tentative="1">
+      <w:start w:val="1"/>
+      <w:numFmt w:val="bullet"/>
+      <w:lvlText w:val="o"/>
+      <w:lvlJc w:val="left"/>
+      <w:pPr>
+        <w:ind w:left="5760" w:hanging="360"/>
+      </w:pPr>
+      <w:rPr>
+        <w:rFonts w:ascii="Courier New" w:hAnsi="Courier New" w:cs="Courier New" w:hint="default"/>
+      </w:rPr>
+    </w:lvl>
+    <w:lvl w:ilvl="8" w:tplc="04090005" w:tentative="1">
+      <w:start w:val="1"/>
+      <w:numFmt w:val="bullet"/>
+      <w:lvlText w:val=""/>
+      <w:lvlJc w:val="left"/>
+      <w:pPr>
+        <w:ind w:left="6480" w:hanging="360"/>
+      </w:pPr>
+      <w:rPr>
+        <w:rFonts w:ascii="Wingdings" w:hAnsi="Wingdings" w:hint="default"/>
+      </w:rPr>
+    </w:lvl>
+  </w:abstractNum>
+  <w:abstractNum w:abstractNumId="10" w15:restartNumberingAfterBreak="0">
     <w:nsid w:val="28451E82"/>
     <w:multiLevelType w:val="hybridMultilevel"/>
     <w:tmpl w:val="35CACEBC"/>
@@ -5914,7 +6049,7 @@
       </w:rPr>
     </w:lvl>
   </w:abstractNum>
-  <w:abstractNum w:abstractNumId="10" w15:restartNumberingAfterBreak="0">
+  <w:abstractNum w:abstractNumId="11" w15:restartNumberingAfterBreak="0">
     <w:nsid w:val="297935DD"/>
     <w:multiLevelType w:val="hybridMultilevel"/>
     <w:tmpl w:val="53985D58"/>
@@ -6027,7 +6162,7 @@
       </w:rPr>
     </w:lvl>
   </w:abstractNum>
-  <w:abstractNum w:abstractNumId="11" w15:restartNumberingAfterBreak="0">
+  <w:abstractNum w:abstractNumId="12" w15:restartNumberingAfterBreak="0">
     <w:nsid w:val="34322ADE"/>
     <w:multiLevelType w:val="hybridMultilevel"/>
     <w:tmpl w:val="83DAC19A"/>
@@ -6140,7 +6275,7 @@
       </w:rPr>
     </w:lvl>
   </w:abstractNum>
-  <w:abstractNum w:abstractNumId="12" w15:restartNumberingAfterBreak="0">
+  <w:abstractNum w:abstractNumId="13" w15:restartNumberingAfterBreak="0">
     <w:nsid w:val="39B34F56"/>
     <w:multiLevelType w:val="hybridMultilevel"/>
     <w:tmpl w:val="AD948B6A"/>
@@ -6253,7 +6388,7 @@
       </w:rPr>
     </w:lvl>
   </w:abstractNum>
-  <w:abstractNum w:abstractNumId="13" w15:restartNumberingAfterBreak="0">
+  <w:abstractNum w:abstractNumId="14" w15:restartNumberingAfterBreak="0">
     <w:nsid w:val="3D3F5192"/>
     <w:multiLevelType w:val="hybridMultilevel"/>
     <w:tmpl w:val="7A40545A"/>
@@ -6366,7 +6501,7 @@
       </w:rPr>
     </w:lvl>
   </w:abstractNum>
-  <w:abstractNum w:abstractNumId="14" w15:restartNumberingAfterBreak="0">
+  <w:abstractNum w:abstractNumId="15" w15:restartNumberingAfterBreak="0">
     <w:nsid w:val="42C26081"/>
     <w:multiLevelType w:val="multilevel"/>
     <w:tmpl w:val="0ABE74CC"/>
@@ -6515,7 +6650,7 @@
       </w:rPr>
     </w:lvl>
   </w:abstractNum>
-  <w:abstractNum w:abstractNumId="15" w15:restartNumberingAfterBreak="0">
+  <w:abstractNum w:abstractNumId="16" w15:restartNumberingAfterBreak="0">
     <w:nsid w:val="51B553F8"/>
     <w:multiLevelType w:val="hybridMultilevel"/>
     <w:tmpl w:val="3E162C22"/>
@@ -6628,7 +6763,7 @@
       </w:rPr>
     </w:lvl>
   </w:abstractNum>
-  <w:abstractNum w:abstractNumId="16" w15:restartNumberingAfterBreak="0">
+  <w:abstractNum w:abstractNumId="17" w15:restartNumberingAfterBreak="0">
     <w:nsid w:val="572735B2"/>
     <w:multiLevelType w:val="hybridMultilevel"/>
     <w:tmpl w:val="435C8316"/>
@@ -6741,7 +6876,7 @@
       </w:rPr>
     </w:lvl>
   </w:abstractNum>
-  <w:abstractNum w:abstractNumId="17" w15:restartNumberingAfterBreak="0">
+  <w:abstractNum w:abstractNumId="18" w15:restartNumberingAfterBreak="0">
     <w:nsid w:val="5899347A"/>
     <w:multiLevelType w:val="hybridMultilevel"/>
     <w:tmpl w:val="64B4C680"/>
@@ -6854,7 +6989,7 @@
       </w:rPr>
     </w:lvl>
   </w:abstractNum>
-  <w:abstractNum w:abstractNumId="18" w15:restartNumberingAfterBreak="0">
+  <w:abstractNum w:abstractNumId="19" w15:restartNumberingAfterBreak="0">
     <w:nsid w:val="5A26288E"/>
     <w:multiLevelType w:val="hybridMultilevel"/>
     <w:tmpl w:val="F49CB9F4"/>
@@ -6967,7 +7102,7 @@
       </w:rPr>
     </w:lvl>
   </w:abstractNum>
-  <w:abstractNum w:abstractNumId="19" w15:restartNumberingAfterBreak="0">
+  <w:abstractNum w:abstractNumId="20" w15:restartNumberingAfterBreak="0">
     <w:nsid w:val="5C951BC4"/>
     <w:multiLevelType w:val="hybridMultilevel"/>
     <w:tmpl w:val="CF5EE9AA"/>
@@ -7080,7 +7215,7 @@
       </w:rPr>
     </w:lvl>
   </w:abstractNum>
-  <w:abstractNum w:abstractNumId="20" w15:restartNumberingAfterBreak="0">
+  <w:abstractNum w:abstractNumId="21" w15:restartNumberingAfterBreak="0">
     <w:nsid w:val="67DE0794"/>
     <w:multiLevelType w:val="hybridMultilevel"/>
     <w:tmpl w:val="C122CDFA"/>
@@ -7193,7 +7328,7 @@
       </w:rPr>
     </w:lvl>
   </w:abstractNum>
-  <w:abstractNum w:abstractNumId="21" w15:restartNumberingAfterBreak="0">
+  <w:abstractNum w:abstractNumId="22" w15:restartNumberingAfterBreak="0">
     <w:nsid w:val="681719F5"/>
     <w:multiLevelType w:val="hybridMultilevel"/>
     <w:tmpl w:val="FA1EFA88"/>
@@ -7306,7 +7441,7 @@
       </w:rPr>
     </w:lvl>
   </w:abstractNum>
-  <w:abstractNum w:abstractNumId="22" w15:restartNumberingAfterBreak="0">
+  <w:abstractNum w:abstractNumId="23" w15:restartNumberingAfterBreak="0">
     <w:nsid w:val="69A4085A"/>
     <w:multiLevelType w:val="hybridMultilevel"/>
     <w:tmpl w:val="22440970"/>
@@ -7419,7 +7554,7 @@
       </w:rPr>
     </w:lvl>
   </w:abstractNum>
-  <w:abstractNum w:abstractNumId="23" w15:restartNumberingAfterBreak="0">
+  <w:abstractNum w:abstractNumId="24" w15:restartNumberingAfterBreak="0">
     <w:nsid w:val="6A4D5DAF"/>
     <w:multiLevelType w:val="hybridMultilevel"/>
     <w:tmpl w:val="7E028C9C"/>
@@ -7532,7 +7667,120 @@
       </w:rPr>
     </w:lvl>
   </w:abstractNum>
-  <w:abstractNum w:abstractNumId="24" w15:restartNumberingAfterBreak="0">
+  <w:abstractNum w:abstractNumId="25" w15:restartNumberingAfterBreak="0">
+    <w:nsid w:val="6AD7123A"/>
+    <w:multiLevelType w:val="hybridMultilevel"/>
+    <w:tmpl w:val="ECBA244C"/>
+    <w:lvl w:ilvl="0" w:tplc="04090001">
+      <w:start w:val="1"/>
+      <w:numFmt w:val="bullet"/>
+      <w:lvlText w:val=""/>
+      <w:lvlJc w:val="left"/>
+      <w:pPr>
+        <w:ind w:left="1080" w:hanging="360"/>
+      </w:pPr>
+      <w:rPr>
+        <w:rFonts w:ascii="Symbol" w:hAnsi="Symbol" w:hint="default"/>
+      </w:rPr>
+    </w:lvl>
+    <w:lvl w:ilvl="1" w:tplc="04090003" w:tentative="1">
+      <w:start w:val="1"/>
+      <w:numFmt w:val="bullet"/>
+      <w:lvlText w:val="o"/>
+      <w:lvlJc w:val="left"/>
+      <w:pPr>
+        <w:ind w:left="1800" w:hanging="360"/>
+      </w:pPr>
+      <w:rPr>
+        <w:rFonts w:ascii="Courier New" w:hAnsi="Courier New" w:cs="Courier New" w:hint="default"/>
+      </w:rPr>
+    </w:lvl>
+    <w:lvl w:ilvl="2" w:tplc="04090005" w:tentative="1">
+      <w:start w:val="1"/>
+      <w:numFmt w:val="bullet"/>
+      <w:lvlText w:val=""/>
+      <w:lvlJc w:val="left"/>
+      <w:pPr>
+        <w:ind w:left="2520" w:hanging="360"/>
+      </w:pPr>
+      <w:rPr>
+        <w:rFonts w:ascii="Wingdings" w:hAnsi="Wingdings" w:hint="default"/>
+      </w:rPr>
+    </w:lvl>
+    <w:lvl w:ilvl="3" w:tplc="04090001" w:tentative="1">
+      <w:start w:val="1"/>
+      <w:numFmt w:val="bullet"/>
+      <w:lvlText w:val=""/>
+      <w:lvlJc w:val="left"/>
+      <w:pPr>
+        <w:ind w:left="3240" w:hanging="360"/>
+      </w:pPr>
+      <w:rPr>
+        <w:rFonts w:ascii="Symbol" w:hAnsi="Symbol" w:hint="default"/>
+      </w:rPr>
+    </w:lvl>
+    <w:lvl w:ilvl="4" w:tplc="04090003" w:tentative="1">
+      <w:start w:val="1"/>
+      <w:numFmt w:val="bullet"/>
+      <w:lvlText w:val="o"/>
+      <w:lvlJc w:val="left"/>
+      <w:pPr>
+        <w:ind w:left="3960" w:hanging="360"/>
+      </w:pPr>
+      <w:rPr>
+        <w:rFonts w:ascii="Courier New" w:hAnsi="Courier New" w:cs="Courier New" w:hint="default"/>
+      </w:rPr>
+    </w:lvl>
+    <w:lvl w:ilvl="5" w:tplc="04090005" w:tentative="1">
+      <w:start w:val="1"/>
+      <w:numFmt w:val="bullet"/>
+      <w:lvlText w:val=""/>
+      <w:lvlJc w:val="left"/>
+      <w:pPr>
+        <w:ind w:left="4680" w:hanging="360"/>
+      </w:pPr>
+      <w:rPr>
+        <w:rFonts w:ascii="Wingdings" w:hAnsi="Wingdings" w:hint="default"/>
+      </w:rPr>
+    </w:lvl>
+    <w:lvl w:ilvl="6" w:tplc="04090001" w:tentative="1">
+      <w:start w:val="1"/>
+      <w:numFmt w:val="bullet"/>
+      <w:lvlText w:val=""/>
+      <w:lvlJc w:val="left"/>
+      <w:pPr>
+        <w:ind w:left="5400" w:hanging="360"/>
+      </w:pPr>
+      <w:rPr>
+        <w:rFonts w:ascii="Symbol" w:hAnsi="Symbol" w:hint="default"/>
+      </w:rPr>
+    </w:lvl>
+    <w:lvl w:ilvl="7" w:tplc="04090003" w:tentative="1">
+      <w:start w:val="1"/>
+      <w:numFmt w:val="bullet"/>
+      <w:lvlText w:val="o"/>
+      <w:lvlJc w:val="left"/>
+      <w:pPr>
+        <w:ind w:left="6120" w:hanging="360"/>
+      </w:pPr>
+      <w:rPr>
+        <w:rFonts w:ascii="Courier New" w:hAnsi="Courier New" w:cs="Courier New" w:hint="default"/>
+      </w:rPr>
+    </w:lvl>
+    <w:lvl w:ilvl="8" w:tplc="04090005" w:tentative="1">
+      <w:start w:val="1"/>
+      <w:numFmt w:val="bullet"/>
+      <w:lvlText w:val=""/>
+      <w:lvlJc w:val="left"/>
+      <w:pPr>
+        <w:ind w:left="6840" w:hanging="360"/>
+      </w:pPr>
+      <w:rPr>
+        <w:rFonts w:ascii="Wingdings" w:hAnsi="Wingdings" w:hint="default"/>
+      </w:rPr>
+    </w:lvl>
+  </w:abstractNum>
+  <w:abstractNum w:abstractNumId="26" w15:restartNumberingAfterBreak="0">
     <w:nsid w:val="7DEF0F0F"/>
     <w:multiLevelType w:val="hybridMultilevel"/>
     <w:tmpl w:val="A204021E"/>
@@ -7652,19 +7900,19 @@
     <w:abstractNumId w:val="6"/>
   </w:num>
   <w:num w:numId="3">
-    <w:abstractNumId w:val="23"/>
+    <w:abstractNumId w:val="24"/>
   </w:num>
   <w:num w:numId="4">
-    <w:abstractNumId w:val="13"/>
+    <w:abstractNumId w:val="14"/>
   </w:num>
   <w:num w:numId="5">
-    <w:abstractNumId w:val="18"/>
+    <w:abstractNumId w:val="19"/>
   </w:num>
   <w:num w:numId="6">
     <w:abstractNumId w:val="8"/>
   </w:num>
   <w:num w:numId="7">
-    <w:abstractNumId w:val="24"/>
+    <w:abstractNumId w:val="26"/>
   </w:num>
   <w:num w:numId="8">
     <w:abstractNumId w:val="0"/>
@@ -7673,34 +7921,34 @@
     <w:abstractNumId w:val="5"/>
   </w:num>
   <w:num w:numId="10">
+    <w:abstractNumId w:val="16"/>
+  </w:num>
+  <w:num w:numId="11">
+    <w:abstractNumId w:val="10"/>
+  </w:num>
+  <w:num w:numId="12">
+    <w:abstractNumId w:val="11"/>
+  </w:num>
+  <w:num w:numId="13">
     <w:abstractNumId w:val="15"/>
   </w:num>
-  <w:num w:numId="11">
-    <w:abstractNumId w:val="9"/>
-  </w:num>
-  <w:num w:numId="12">
-    <w:abstractNumId w:val="10"/>
-  </w:num>
-  <w:num w:numId="13">
-    <w:abstractNumId w:val="14"/>
-  </w:num>
   <w:num w:numId="14">
-    <w:abstractNumId w:val="12"/>
+    <w:abstractNumId w:val="13"/>
   </w:num>
   <w:num w:numId="15">
-    <w:abstractNumId w:val="17"/>
+    <w:abstractNumId w:val="18"/>
   </w:num>
   <w:num w:numId="16">
-    <w:abstractNumId w:val="21"/>
+    <w:abstractNumId w:val="22"/>
   </w:num>
   <w:num w:numId="17">
-    <w:abstractNumId w:val="22"/>
+    <w:abstractNumId w:val="23"/>
   </w:num>
   <w:num w:numId="18">
     <w:abstractNumId w:val="4"/>
   </w:num>
   <w:num w:numId="19">
-    <w:abstractNumId w:val="20"/>
+    <w:abstractNumId w:val="21"/>
   </w:num>
   <w:num w:numId="20">
     <w:abstractNumId w:val="3"/>
@@ -7709,16 +7957,22 @@
     <w:abstractNumId w:val="7"/>
   </w:num>
   <w:num w:numId="22">
-    <w:abstractNumId w:val="19"/>
+    <w:abstractNumId w:val="20"/>
   </w:num>
   <w:num w:numId="23">
-    <w:abstractNumId w:val="11"/>
+    <w:abstractNumId w:val="12"/>
   </w:num>
   <w:num w:numId="24">
-    <w:abstractNumId w:val="16"/>
+    <w:abstractNumId w:val="17"/>
   </w:num>
   <w:num w:numId="25">
     <w:abstractNumId w:val="1"/>
+  </w:num>
+  <w:num w:numId="26">
+    <w:abstractNumId w:val="9"/>
+  </w:num>
+  <w:num w:numId="27">
+    <w:abstractNumId w:val="25"/>
   </w:num>
 </w:numbering>
 </file>
@@ -8204,6 +8458,7 @@
   <w:style w:type="character" w:default="1" w:styleId="DefaultParagraphFont">
     <w:name w:val="Default Paragraph Font"/>
     <w:uiPriority w:val="1"/>
+    <w:semiHidden/>
     <w:unhideWhenUsed/>
   </w:style>
   <w:style w:type="table" w:default="1" w:styleId="TableNormal">

</xml_diff>